<commit_message>
Initial EdgeOne Terraform workshop
</commit_message>
<xml_diff>
--- a/agenda/agenda-3day-3hour-cn.docx
+++ b/agenda/agenda-3day-3hour-cn.docx
@@ -28,19 +28,6 @@
           <w:sz w:val="18"/>
         </w:rPr>
         <w:t>3 天培训 Agenda：每天 3 小时，EdgeOne 实操优先版</w:t>
-      </w:r>
-    </w:p>
-    <w:p>
-      <w:pPr>
-        <w:spacing w:after="60"/>
-      </w:pPr>
-      <w:r>
-        <w:rPr>
-          <w:rFonts w:ascii="Arial Unicode MS" w:hAnsi="Arial Unicode MS" w:eastAsia="Heiti SC"/>
-          <w:b w:val="0"/>
-          <w:sz w:val="18"/>
-        </w:rPr>
-        <w:t>版本日期：2026-08-01</w:t>
       </w:r>
     </w:p>
     <w:p>

</xml_diff>